<commit_message>
now finally can write directly to docx file
</commit_message>
<xml_diff>
--- a/src/steps/docx_output/thesis_analysis.docx
+++ b/src/steps/docx_output/thesis_analysis.docx
@@ -128,6 +128,114 @@
                   </pic:nvPicPr>
                   <pic:blipFill>
                     <a:blip r:embed="rId9"/>
+                    <a:stretch>
+                      <a:fillRect/>
+                    </a:stretch>
+                  </pic:blipFill>
+                  <pic:spPr>
+                    <a:xfrm>
+                      <a:off x="0" y="0"/>
+                      <a:ext cx="3657600" cy="2743200"/>
+                    </a:xfrm>
+                    <a:prstGeom prst="rect"/>
+                  </pic:spPr>
+                </pic:pic>
+              </a:graphicData>
+            </a:graphic>
+          </wp:inline>
+        </w:drawing>
+      </w:r>
+    </w:p>
+    <w:p>
+      <w:r>
+        <w:drawing>
+          <wp:inline xmlns:a="http://schemas.openxmlformats.org/drawingml/2006/main" xmlns:pic="http://schemas.openxmlformats.org/drawingml/2006/picture">
+            <wp:extent cx="3657600" cy="2743200"/>
+            <wp:docPr id="2" name="Picture 2"/>
+            <wp:cNvGraphicFramePr>
+              <a:graphicFrameLocks noChangeAspect="1"/>
+            </wp:cNvGraphicFramePr>
+            <a:graphic>
+              <a:graphicData uri="http://schemas.openxmlformats.org/drawingml/2006/picture">
+                <pic:pic>
+                  <pic:nvPicPr>
+                    <pic:cNvPr id="0" name="image.png"/>
+                    <pic:cNvPicPr/>
+                  </pic:nvPicPr>
+                  <pic:blipFill>
+                    <a:blip r:embed="rId10"/>
+                    <a:stretch>
+                      <a:fillRect/>
+                    </a:stretch>
+                  </pic:blipFill>
+                  <pic:spPr>
+                    <a:xfrm>
+                      <a:off x="0" y="0"/>
+                      <a:ext cx="3657600" cy="2743200"/>
+                    </a:xfrm>
+                    <a:prstGeom prst="rect"/>
+                  </pic:spPr>
+                </pic:pic>
+              </a:graphicData>
+            </a:graphic>
+          </wp:inline>
+        </w:drawing>
+      </w:r>
+    </w:p>
+    <w:p>
+      <w:r>
+        <w:drawing>
+          <wp:inline xmlns:a="http://schemas.openxmlformats.org/drawingml/2006/main" xmlns:pic="http://schemas.openxmlformats.org/drawingml/2006/picture">
+            <wp:extent cx="3657600" cy="2743200"/>
+            <wp:docPr id="3" name="Picture 3"/>
+            <wp:cNvGraphicFramePr>
+              <a:graphicFrameLocks noChangeAspect="1"/>
+            </wp:cNvGraphicFramePr>
+            <a:graphic>
+              <a:graphicData uri="http://schemas.openxmlformats.org/drawingml/2006/picture">
+                <pic:pic>
+                  <pic:nvPicPr>
+                    <pic:cNvPr id="0" name="image.png"/>
+                    <pic:cNvPicPr/>
+                  </pic:nvPicPr>
+                  <pic:blipFill>
+                    <a:blip r:embed="rId11"/>
+                    <a:stretch>
+                      <a:fillRect/>
+                    </a:stretch>
+                  </pic:blipFill>
+                  <pic:spPr>
+                    <a:xfrm>
+                      <a:off x="0" y="0"/>
+                      <a:ext cx="3657600" cy="2743200"/>
+                    </a:xfrm>
+                    <a:prstGeom prst="rect"/>
+                  </pic:spPr>
+                </pic:pic>
+              </a:graphicData>
+            </a:graphic>
+          </wp:inline>
+        </w:drawing>
+      </w:r>
+    </w:p>
+    <w:p>
+      <w:r>
+        <w:drawing>
+          <wp:inline xmlns:a="http://schemas.openxmlformats.org/drawingml/2006/main" xmlns:pic="http://schemas.openxmlformats.org/drawingml/2006/picture">
+            <wp:extent cx="3657600" cy="2743200"/>
+            <wp:docPr id="4" name="Picture 4"/>
+            <wp:cNvGraphicFramePr>
+              <a:graphicFrameLocks noChangeAspect="1"/>
+            </wp:cNvGraphicFramePr>
+            <a:graphic>
+              <a:graphicData uri="http://schemas.openxmlformats.org/drawingml/2006/picture">
+                <pic:pic>
+                  <pic:nvPicPr>
+                    <pic:cNvPr id="0" name="image.png"/>
+                    <pic:cNvPicPr/>
+                  </pic:nvPicPr>
+                  <pic:blipFill>
+                    <a:blip r:embed="rId12"/>
                     <a:stretch>
                       <a:fillRect/>
                     </a:stretch>

</xml_diff>

<commit_message>
now we can combine reference as well
</commit_message>
<xml_diff>
--- a/src/steps/docx_output/thesis_analysis.docx
+++ b/src/steps/docx_output/thesis_analysis.docx
@@ -254,6 +254,647 @@
         </w:drawing>
       </w:r>
     </w:p>
+    <w:tbl>
+      <w:tblPr>
+        <w:tblStyle w:val="TableGrid"/>
+        <w:tblW w:type="auto" w:w="0"/>
+        <w:tblLook w:firstColumn="1" w:firstRow="1" w:lastColumn="0" w:lastRow="0" w:noHBand="0" w:noVBand="1" w:val="04A0"/>
+      </w:tblPr>
+      <w:tblGrid>
+        <w:gridCol w:w="2880"/>
+        <w:gridCol w:w="2880"/>
+        <w:gridCol w:w="2880"/>
+      </w:tblGrid>
+      <w:tr>
+        <w:tc>
+          <w:tcPr>
+            <w:tcW w:type="dxa" w:w="2880"/>
+          </w:tcPr>
+          <w:p>
+            <w:r>
+              <w:t>Row 1, Col 1</w:t>
+            </w:r>
+          </w:p>
+        </w:tc>
+        <w:tc>
+          <w:tcPr>
+            <w:tcW w:type="dxa" w:w="2880"/>
+          </w:tcPr>
+          <w:p>
+            <w:r>
+              <w:t>Row 1, Col 2</w:t>
+            </w:r>
+          </w:p>
+        </w:tc>
+        <w:tc>
+          <w:tcPr>
+            <w:tcW w:type="dxa" w:w="2880"/>
+          </w:tcPr>
+          <w:p>
+            <w:r>
+              <w:t>Row 1, Col 3</w:t>
+            </w:r>
+          </w:p>
+        </w:tc>
+      </w:tr>
+      <w:tr>
+        <w:tc>
+          <w:tcPr>
+            <w:tcW w:type="dxa" w:w="2880"/>
+          </w:tcPr>
+          <w:p>
+            <w:r>
+              <w:t>Row 2, Col 1</w:t>
+            </w:r>
+          </w:p>
+        </w:tc>
+        <w:tc>
+          <w:tcPr>
+            <w:tcW w:type="dxa" w:w="2880"/>
+          </w:tcPr>
+          <w:p>
+            <w:r>
+              <w:t>Row 2, Col 2</w:t>
+            </w:r>
+          </w:p>
+        </w:tc>
+        <w:tc>
+          <w:tcPr>
+            <w:tcW w:type="dxa" w:w="2880"/>
+          </w:tcPr>
+          <w:p>
+            <w:r>
+              <w:t>Row 2, Col 3</w:t>
+            </w:r>
+          </w:p>
+        </w:tc>
+      </w:tr>
+      <w:tr>
+        <w:tc>
+          <w:tcPr>
+            <w:tcW w:type="dxa" w:w="2880"/>
+          </w:tcPr>
+          <w:p>
+            <w:r>
+              <w:t>Row 3, Col 1</w:t>
+            </w:r>
+          </w:p>
+        </w:tc>
+        <w:tc>
+          <w:tcPr>
+            <w:tcW w:type="dxa" w:w="2880"/>
+          </w:tcPr>
+          <w:p>
+            <w:r>
+              <w:t>Row 3, Col 2</w:t>
+            </w:r>
+          </w:p>
+        </w:tc>
+        <w:tc>
+          <w:tcPr>
+            <w:tcW w:type="dxa" w:w="2880"/>
+          </w:tcPr>
+          <w:p>
+            <w:r>
+              <w:t>Row 3, Col 3</w:t>
+            </w:r>
+          </w:p>
+        </w:tc>
+      </w:tr>
+    </w:tbl>
+    <w:p>
+      <w:r>
+        <w:drawing>
+          <wp:inline xmlns:a="http://schemas.openxmlformats.org/drawingml/2006/main" xmlns:pic="http://schemas.openxmlformats.org/drawingml/2006/picture">
+            <wp:extent cx="3657600" cy="2743200"/>
+            <wp:docPr id="5" name="Picture 5"/>
+            <wp:cNvGraphicFramePr>
+              <a:graphicFrameLocks noChangeAspect="1"/>
+            </wp:cNvGraphicFramePr>
+            <a:graphic>
+              <a:graphicData uri="http://schemas.openxmlformats.org/drawingml/2006/picture">
+                <pic:pic>
+                  <pic:nvPicPr>
+                    <pic:cNvPr id="0" name="image.png"/>
+                    <pic:cNvPicPr/>
+                  </pic:nvPicPr>
+                  <pic:blipFill>
+                    <a:blip r:embed="rId13"/>
+                    <a:stretch>
+                      <a:fillRect/>
+                    </a:stretch>
+                  </pic:blipFill>
+                  <pic:spPr>
+                    <a:xfrm>
+                      <a:off x="0" y="0"/>
+                      <a:ext cx="3657600" cy="2743200"/>
+                    </a:xfrm>
+                    <a:prstGeom prst="rect"/>
+                  </pic:spPr>
+                </pic:pic>
+              </a:graphicData>
+            </a:graphic>
+          </wp:inline>
+        </w:drawing>
+      </w:r>
+    </w:p>
+    <w:sectPr>
+      <w:pgSz w:w="12240" w:h="15840"/>
+      <w:pgMar w:top="1440" w:right="1800" w:bottom="1440" w:left="1800" w:header="720" w:footer="720" w:gutter="0"/>
+      <w:cols w:space="720"/>
+      <w:docGrid w:linePitch="360"/>
+    </w:sectPr>
+    <w:p>
+      <w:pPr>
+        <w:pStyle w:val="Heading1"/>
+      </w:pPr>
+      <w:r>
+        <w:t>References</w:t>
+      </w:r>
+    </w:p>
+    <w:p>
+      <w:r>
+        <w:t>1. Author A. (Year). Title of the paper. Journal Name, Volume(Issue), pages.</w:t>
+      </w:r>
+    </w:p>
+    <w:p>
+      <w:r>
+        <w:t>2. Author B. (Year). Title of the book. Publisher.</w:t>
+      </w:r>
+    </w:p>
+    <w:tbl>
+      <w:tblPr>
+        <w:tblStyle w:val="TableGrid"/>
+        <w:tblW w:type="auto" w:w="0"/>
+        <w:tblLook w:firstColumn="1" w:firstRow="1" w:lastColumn="0" w:lastRow="0" w:noHBand="0" w:noVBand="1" w:val="04A0"/>
+      </w:tblPr>
+      <w:tblGrid>
+        <w:gridCol w:w="4320"/>
+        <w:gridCol w:w="4320"/>
+      </w:tblGrid>
+      <w:tr>
+        <w:tc>
+          <w:tcPr>
+            <w:tcW w:type="dxa" w:w="4320"/>
+          </w:tcPr>
+          <w:p>
+            <w:r>
+              <w:t>Index</w:t>
+            </w:r>
+          </w:p>
+        </w:tc>
+        <w:tc>
+          <w:tcPr>
+            <w:tcW w:type="dxa" w:w="4320"/>
+          </w:tcPr>
+          <w:p>
+            <w:r>
+              <w:t>Description</w:t>
+            </w:r>
+          </w:p>
+        </w:tc>
+      </w:tr>
+      <w:tr>
+        <w:tc>
+          <w:tcPr>
+            <w:tcW w:type="dxa" w:w="4320"/>
+          </w:tcPr>
+          <w:p>
+            <w:r>
+              <w:t>1</w:t>
+            </w:r>
+          </w:p>
+        </w:tc>
+        <w:tc>
+          <w:tcPr>
+            <w:tcW w:type="dxa" w:w="4320"/>
+          </w:tcPr>
+          <w:p>
+            <w:r>
+              <w:t>Description for item 1</w:t>
+            </w:r>
+          </w:p>
+        </w:tc>
+      </w:tr>
+      <w:tr>
+        <w:tc>
+          <w:tcPr>
+            <w:tcW w:type="dxa" w:w="4320"/>
+          </w:tcPr>
+          <w:p>
+            <w:r>
+              <w:t>2</w:t>
+            </w:r>
+          </w:p>
+        </w:tc>
+        <w:tc>
+          <w:tcPr>
+            <w:tcW w:type="dxa" w:w="4320"/>
+          </w:tcPr>
+          <w:p>
+            <w:r>
+              <w:t>Description for item 2</w:t>
+            </w:r>
+          </w:p>
+        </w:tc>
+      </w:tr>
+      <w:tr>
+        <w:tc>
+          <w:tcPr>
+            <w:tcW w:type="dxa" w:w="4320"/>
+          </w:tcPr>
+          <w:p>
+            <w:r>
+              <w:t>3</w:t>
+            </w:r>
+          </w:p>
+        </w:tc>
+        <w:tc>
+          <w:tcPr>
+            <w:tcW w:type="dxa" w:w="4320"/>
+          </w:tcPr>
+          <w:p>
+            <w:r>
+              <w:t>Description for item 3</w:t>
+            </w:r>
+          </w:p>
+        </w:tc>
+      </w:tr>
+      <w:tr>
+        <w:tc>
+          <w:tcPr>
+            <w:tcW w:type="dxa" w:w="4320"/>
+          </w:tcPr>
+          <w:p>
+            <w:r>
+              <w:t>4</w:t>
+            </w:r>
+          </w:p>
+        </w:tc>
+        <w:tc>
+          <w:tcPr>
+            <w:tcW w:type="dxa" w:w="4320"/>
+          </w:tcPr>
+          <w:p>
+            <w:r>
+              <w:t>Description for item 4</w:t>
+            </w:r>
+          </w:p>
+        </w:tc>
+      </w:tr>
+      <w:tr>
+        <w:tc>
+          <w:tcPr>
+            <w:tcW w:type="dxa" w:w="4320"/>
+          </w:tcPr>
+          <w:p>
+            <w:r>
+              <w:t>5</w:t>
+            </w:r>
+          </w:p>
+        </w:tc>
+        <w:tc>
+          <w:tcPr>
+            <w:tcW w:type="dxa" w:w="4320"/>
+          </w:tcPr>
+          <w:p>
+            <w:r>
+              <w:t>Description for item 5</w:t>
+            </w:r>
+          </w:p>
+        </w:tc>
+      </w:tr>
+      <w:tr>
+        <w:tc>
+          <w:tcPr>
+            <w:tcW w:type="dxa" w:w="4320"/>
+          </w:tcPr>
+          <w:p>
+            <w:r>
+              <w:t>6</w:t>
+            </w:r>
+          </w:p>
+        </w:tc>
+        <w:tc>
+          <w:tcPr>
+            <w:tcW w:type="dxa" w:w="4320"/>
+          </w:tcPr>
+          <w:p>
+            <w:r>
+              <w:t>Description for item 6</w:t>
+            </w:r>
+          </w:p>
+        </w:tc>
+      </w:tr>
+      <w:tr>
+        <w:tc>
+          <w:tcPr>
+            <w:tcW w:type="dxa" w:w="4320"/>
+          </w:tcPr>
+          <w:p>
+            <w:r>
+              <w:t>7</w:t>
+            </w:r>
+          </w:p>
+        </w:tc>
+        <w:tc>
+          <w:tcPr>
+            <w:tcW w:type="dxa" w:w="4320"/>
+          </w:tcPr>
+          <w:p>
+            <w:r>
+              <w:t>Description for item 7</w:t>
+            </w:r>
+          </w:p>
+        </w:tc>
+      </w:tr>
+      <w:tr>
+        <w:tc>
+          <w:tcPr>
+            <w:tcW w:type="dxa" w:w="4320"/>
+          </w:tcPr>
+          <w:p>
+            <w:r>
+              <w:t>8</w:t>
+            </w:r>
+          </w:p>
+        </w:tc>
+        <w:tc>
+          <w:tcPr>
+            <w:tcW w:type="dxa" w:w="4320"/>
+          </w:tcPr>
+          <w:p>
+            <w:r>
+              <w:t>Description for item 8</w:t>
+            </w:r>
+          </w:p>
+        </w:tc>
+      </w:tr>
+      <w:tr>
+        <w:tc>
+          <w:tcPr>
+            <w:tcW w:type="dxa" w:w="4320"/>
+          </w:tcPr>
+          <w:p>
+            <w:r>
+              <w:t>9</w:t>
+            </w:r>
+          </w:p>
+        </w:tc>
+        <w:tc>
+          <w:tcPr>
+            <w:tcW w:type="dxa" w:w="4320"/>
+          </w:tcPr>
+          <w:p>
+            <w:r>
+              <w:t>Description for item 9</w:t>
+            </w:r>
+          </w:p>
+        </w:tc>
+      </w:tr>
+      <w:tr>
+        <w:tc>
+          <w:tcPr>
+            <w:tcW w:type="dxa" w:w="4320"/>
+          </w:tcPr>
+          <w:p>
+            <w:r>
+              <w:t>10</w:t>
+            </w:r>
+          </w:p>
+        </w:tc>
+        <w:tc>
+          <w:tcPr>
+            <w:tcW w:type="dxa" w:w="4320"/>
+          </w:tcPr>
+          <w:p>
+            <w:r>
+              <w:t>Description for item 10</w:t>
+            </w:r>
+          </w:p>
+        </w:tc>
+      </w:tr>
+      <w:tr>
+        <w:tc>
+          <w:tcPr>
+            <w:tcW w:type="dxa" w:w="4320"/>
+          </w:tcPr>
+          <w:p>
+            <w:r>
+              <w:t>11</w:t>
+            </w:r>
+          </w:p>
+        </w:tc>
+        <w:tc>
+          <w:tcPr>
+            <w:tcW w:type="dxa" w:w="4320"/>
+          </w:tcPr>
+          <w:p>
+            <w:r>
+              <w:t>Description for item 11</w:t>
+            </w:r>
+          </w:p>
+        </w:tc>
+      </w:tr>
+      <w:tr>
+        <w:tc>
+          <w:tcPr>
+            <w:tcW w:type="dxa" w:w="4320"/>
+          </w:tcPr>
+          <w:p>
+            <w:r>
+              <w:t>12</w:t>
+            </w:r>
+          </w:p>
+        </w:tc>
+        <w:tc>
+          <w:tcPr>
+            <w:tcW w:type="dxa" w:w="4320"/>
+          </w:tcPr>
+          <w:p>
+            <w:r>
+              <w:t>Description for item 12</w:t>
+            </w:r>
+          </w:p>
+        </w:tc>
+      </w:tr>
+      <w:tr>
+        <w:tc>
+          <w:tcPr>
+            <w:tcW w:type="dxa" w:w="4320"/>
+          </w:tcPr>
+          <w:p>
+            <w:r>
+              <w:t>13</w:t>
+            </w:r>
+          </w:p>
+        </w:tc>
+        <w:tc>
+          <w:tcPr>
+            <w:tcW w:type="dxa" w:w="4320"/>
+          </w:tcPr>
+          <w:p>
+            <w:r>
+              <w:t>Description for item 13</w:t>
+            </w:r>
+          </w:p>
+        </w:tc>
+      </w:tr>
+      <w:tr>
+        <w:tc>
+          <w:tcPr>
+            <w:tcW w:type="dxa" w:w="4320"/>
+          </w:tcPr>
+          <w:p>
+            <w:r>
+              <w:t>14</w:t>
+            </w:r>
+          </w:p>
+        </w:tc>
+        <w:tc>
+          <w:tcPr>
+            <w:tcW w:type="dxa" w:w="4320"/>
+          </w:tcPr>
+          <w:p>
+            <w:r>
+              <w:t>Description for item 14</w:t>
+            </w:r>
+          </w:p>
+        </w:tc>
+      </w:tr>
+      <w:tr>
+        <w:tc>
+          <w:tcPr>
+            <w:tcW w:type="dxa" w:w="4320"/>
+          </w:tcPr>
+          <w:p>
+            <w:r>
+              <w:t>15</w:t>
+            </w:r>
+          </w:p>
+        </w:tc>
+        <w:tc>
+          <w:tcPr>
+            <w:tcW w:type="dxa" w:w="4320"/>
+          </w:tcPr>
+          <w:p>
+            <w:r>
+              <w:t>Description for item 15</w:t>
+            </w:r>
+          </w:p>
+        </w:tc>
+      </w:tr>
+      <w:tr>
+        <w:tc>
+          <w:tcPr>
+            <w:tcW w:type="dxa" w:w="4320"/>
+          </w:tcPr>
+          <w:p>
+            <w:r>
+              <w:t>16</w:t>
+            </w:r>
+          </w:p>
+        </w:tc>
+        <w:tc>
+          <w:tcPr>
+            <w:tcW w:type="dxa" w:w="4320"/>
+          </w:tcPr>
+          <w:p>
+            <w:r>
+              <w:t>Description for item 16</w:t>
+            </w:r>
+          </w:p>
+        </w:tc>
+      </w:tr>
+      <w:tr>
+        <w:tc>
+          <w:tcPr>
+            <w:tcW w:type="dxa" w:w="4320"/>
+          </w:tcPr>
+          <w:p>
+            <w:r>
+              <w:t>17</w:t>
+            </w:r>
+          </w:p>
+        </w:tc>
+        <w:tc>
+          <w:tcPr>
+            <w:tcW w:type="dxa" w:w="4320"/>
+          </w:tcPr>
+          <w:p>
+            <w:r>
+              <w:t>Description for item 17</w:t>
+            </w:r>
+          </w:p>
+        </w:tc>
+      </w:tr>
+      <w:tr>
+        <w:tc>
+          <w:tcPr>
+            <w:tcW w:type="dxa" w:w="4320"/>
+          </w:tcPr>
+          <w:p>
+            <w:r>
+              <w:t>18</w:t>
+            </w:r>
+          </w:p>
+        </w:tc>
+        <w:tc>
+          <w:tcPr>
+            <w:tcW w:type="dxa" w:w="4320"/>
+          </w:tcPr>
+          <w:p>
+            <w:r>
+              <w:t>Description for item 18</w:t>
+            </w:r>
+          </w:p>
+        </w:tc>
+      </w:tr>
+      <w:tr>
+        <w:tc>
+          <w:tcPr>
+            <w:tcW w:type="dxa" w:w="4320"/>
+          </w:tcPr>
+          <w:p>
+            <w:r>
+              <w:t>19</w:t>
+            </w:r>
+          </w:p>
+        </w:tc>
+        <w:tc>
+          <w:tcPr>
+            <w:tcW w:type="dxa" w:w="4320"/>
+          </w:tcPr>
+          <w:p>
+            <w:r>
+              <w:t>Description for item 19</w:t>
+            </w:r>
+          </w:p>
+        </w:tc>
+      </w:tr>
+      <w:tr>
+        <w:tc>
+          <w:tcPr>
+            <w:tcW w:type="dxa" w:w="4320"/>
+          </w:tcPr>
+          <w:p>
+            <w:r>
+              <w:t>20</w:t>
+            </w:r>
+          </w:p>
+        </w:tc>
+        <w:tc>
+          <w:tcPr>
+            <w:tcW w:type="dxa" w:w="4320"/>
+          </w:tcPr>
+          <w:p>
+            <w:r>
+              <w:t>Description for item 20</w:t>
+            </w:r>
+          </w:p>
+        </w:tc>
+      </w:tr>
+    </w:tbl>
     <w:sectPr>
       <w:pgSz w:w="12240" w:h="15840"/>
       <w:pgMar w:top="1440" w:right="1800" w:bottom="1440" w:left="1800" w:header="720" w:footer="720" w:gutter="0"/>

</xml_diff>

<commit_message>
prints candles to analyze
</commit_message>
<xml_diff>
--- a/src/steps/docx_output/thesis_analysis.docx
+++ b/src/steps/docx_output/thesis_analysis.docx
@@ -66,7 +66,7 @@
             <w:r>
               <w:rPr>
                 <w:b/>
-                <w:color w:val="FF0000"/>
+                <w:color w:val="0000FF"/>
               </w:rPr>
               <w:t>Name</w:t>
             </w:r>
@@ -80,7 +80,7 @@
             <w:r>
               <w:rPr>
                 <w:b/>
-                <w:color w:val="FF0000"/>
+                <w:color w:val="0000FF"/>
               </w:rPr>
               <w:t>Age</w:t>
             </w:r>
@@ -254,114 +254,6 @@
         </w:drawing>
       </w:r>
     </w:p>
-    <w:tbl>
-      <w:tblPr>
-        <w:tblStyle w:val="TableGrid"/>
-        <w:tblW w:type="auto" w:w="0"/>
-        <w:tblLook w:firstColumn="1" w:firstRow="1" w:lastColumn="0" w:lastRow="0" w:noHBand="0" w:noVBand="1" w:val="04A0"/>
-      </w:tblPr>
-      <w:tblGrid>
-        <w:gridCol w:w="2880"/>
-        <w:gridCol w:w="2880"/>
-        <w:gridCol w:w="2880"/>
-      </w:tblGrid>
-      <w:tr>
-        <w:tc>
-          <w:tcPr>
-            <w:tcW w:type="dxa" w:w="2880"/>
-          </w:tcPr>
-          <w:p>
-            <w:r>
-              <w:t>Row 1, Col 1</w:t>
-            </w:r>
-          </w:p>
-        </w:tc>
-        <w:tc>
-          <w:tcPr>
-            <w:tcW w:type="dxa" w:w="2880"/>
-          </w:tcPr>
-          <w:p>
-            <w:r>
-              <w:t>Row 1, Col 2</w:t>
-            </w:r>
-          </w:p>
-        </w:tc>
-        <w:tc>
-          <w:tcPr>
-            <w:tcW w:type="dxa" w:w="2880"/>
-          </w:tcPr>
-          <w:p>
-            <w:r>
-              <w:t>Row 1, Col 3</w:t>
-            </w:r>
-          </w:p>
-        </w:tc>
-      </w:tr>
-      <w:tr>
-        <w:tc>
-          <w:tcPr>
-            <w:tcW w:type="dxa" w:w="2880"/>
-          </w:tcPr>
-          <w:p>
-            <w:r>
-              <w:t>Row 2, Col 1</w:t>
-            </w:r>
-          </w:p>
-        </w:tc>
-        <w:tc>
-          <w:tcPr>
-            <w:tcW w:type="dxa" w:w="2880"/>
-          </w:tcPr>
-          <w:p>
-            <w:r>
-              <w:t>Row 2, Col 2</w:t>
-            </w:r>
-          </w:p>
-        </w:tc>
-        <w:tc>
-          <w:tcPr>
-            <w:tcW w:type="dxa" w:w="2880"/>
-          </w:tcPr>
-          <w:p>
-            <w:r>
-              <w:t>Row 2, Col 3</w:t>
-            </w:r>
-          </w:p>
-        </w:tc>
-      </w:tr>
-      <w:tr>
-        <w:tc>
-          <w:tcPr>
-            <w:tcW w:type="dxa" w:w="2880"/>
-          </w:tcPr>
-          <w:p>
-            <w:r>
-              <w:t>Row 3, Col 1</w:t>
-            </w:r>
-          </w:p>
-        </w:tc>
-        <w:tc>
-          <w:tcPr>
-            <w:tcW w:type="dxa" w:w="2880"/>
-          </w:tcPr>
-          <w:p>
-            <w:r>
-              <w:t>Row 3, Col 2</w:t>
-            </w:r>
-          </w:p>
-        </w:tc>
-        <w:tc>
-          <w:tcPr>
-            <w:tcW w:type="dxa" w:w="2880"/>
-          </w:tcPr>
-          <w:p>
-            <w:r>
-              <w:t>Row 3, Col 3</w:t>
-            </w:r>
-          </w:p>
-        </w:tc>
-      </w:tr>
-    </w:tbl>
     <w:p>
       <w:r>
         <w:drawing>
@@ -439,6 +331,10 @@
           </w:tcPr>
           <w:p>
             <w:r>
+              <w:rPr>
+                <w:b/>
+                <w:color w:val="0000FF"/>
+              </w:rPr>
               <w:t>Index</w:t>
             </w:r>
           </w:p>
@@ -449,6 +345,10 @@
           </w:tcPr>
           <w:p>
             <w:r>
+              <w:rPr>
+                <w:b/>
+                <w:color w:val="0000FF"/>
+              </w:rPr>
               <w:t>Description</w:t>
             </w:r>
           </w:p>

</xml_diff>